<commit_message>
Remove confidential details and phone number; replace slogan
- Resume (HTML, Word, PDF): drop forward-looking roadmap items (Q4 rollout,
  next-year legacy conversion, in-progress site closures), security
  footprint detail (systems, data center and Azure region counts, EDR
  vendor), and the IT headcount reduction figure
- Word and PDF: remove phone number from the public copies
- Replace "Create, Evolve, Refactor, Resolve" with a positioning line on
  the landing page and resume page

Co-Authored-By: Claude Opus 5.5 <noreply@anthropic.com>
Claude-Session: https://claude.ai/code/session_013FwyZkdZj7UxwJTDWdxFFv
</commit_message>
<xml_diff>
--- a/documents/DanielBalthaserResume.docx
+++ b/documents/DanielBalthaserResume.docx
@@ -30,7 +30,7 @@
           <w:sz w:val="19"/>
           <w:szCs w:val="19"/>
         </w:rPr>
-        <w:t xml:space="preserve">Denver, Colorado Area • 484-857-7007 • dan@danbalthaser.com • linkedin.com/in/daniel-balthaser</w:t>
+        <w:t xml:space="preserve">Denver, Colorado Area • dan@danbalthaser.com • linkedin.com/in/daniel-balthaser</w:t>
       </w:r>
     </w:p>
     <w:p>
@@ -622,17 +622,7 @@
           <w:sz w:val="20"/>
           <w:szCs w:val="20"/>
         </w:rPr>
-        <w:t xml:space="preserve">Executive VP, IT and Engineering</w:t>
-      </w:r>
-      <w:r>
-        <w:rPr>
-          <w:rFonts w:ascii="Calibri" w:cs="Calibri" w:eastAsia="Calibri" w:hAnsi="Calibri"/>
-          <w:b/>
-          <w:bCs/>
-          <w:sz w:val="20"/>
-          <w:szCs w:val="20"/>
-        </w:rPr>
-        <w:t xml:space="preserve">	Sep 2025 – Present</w:t>
+        <w:t xml:space="preserve">Executive VP, IT and Engineering	Sep 2025 – Present</w:t>
       </w:r>
     </w:p>
     <w:p>
@@ -651,71 +641,61 @@
           <w:sz w:val="19"/>
           <w:szCs w:val="19"/>
         </w:rPr>
-        <w:t xml:space="preserve">KLDiscovery, LLC</w:t>
-      </w:r>
-      <w:r>
-        <w:rPr>
-          <w:rFonts w:ascii="Calibri" w:cs="Calibri" w:eastAsia="Calibri" w:hAnsi="Calibri"/>
-          <w:i/>
-          <w:iCs/>
-          <w:sz w:val="19"/>
-          <w:szCs w:val="19"/>
-        </w:rPr>
-        <w:t xml:space="preserve">	Remote, Greater Denver Area, CO</w:t>
-      </w:r>
-    </w:p>
-    <w:p>
-      <w:pPr>
-        <w:pStyle w:val="ListParagraph"/>
-        <w:numPr>
-          <w:ilvl w:val="0"/>
-          <w:numId w:val="2"/>
-        </w:numPr>
-        <w:spacing w:after="30"/>
-      </w:pPr>
-      <w:r>
-        <w:rPr>
-          <w:rFonts w:ascii="Calibri" w:cs="Calibri" w:eastAsia="Calibri" w:hAnsi="Calibri"/>
-          <w:sz w:val="19"/>
-          <w:szCs w:val="19"/>
-        </w:rPr>
-        <w:t xml:space="preserve">Directed architecture for Nebula AI Case Explorer, an AI-powered early case assessment product taken from concept to launch in 8 months, with its first paying client signed within two weeks. Leading the Q4 rollout of AI-assisted document review, pairing OpenAI models with the company's existing predictive-coding ML to combine AI speed with traditional-ML defensibility.</w:t>
-      </w:r>
-    </w:p>
-    <w:p>
-      <w:pPr>
-        <w:pStyle w:val="ListParagraph"/>
-        <w:numPr>
-          <w:ilvl w:val="0"/>
-          <w:numId w:val="2"/>
-        </w:numPr>
-        <w:spacing w:after="30"/>
-      </w:pPr>
-      <w:r>
-        <w:rPr>
-          <w:rFonts w:ascii="Calibri" w:cs="Calibri" w:eastAsia="Calibri" w:hAnsi="Calibri"/>
-          <w:sz w:val="19"/>
-          <w:szCs w:val="19"/>
-        </w:rPr>
-        <w:t xml:space="preserve">Consolidated eDiscovery processing onto a single workflow (Nebula ECA), enabling ECA to be sold as an entry point to hosting. Software is complete and all new matters run on it; legacy matters convert next year, sequenced so data aging shrinks the migration scope. Extended AI into the product with an in-app ReadySuite agent that completes user actions from natural-language prompts.</w:t>
-      </w:r>
-    </w:p>
-    <w:p>
-      <w:pPr>
-        <w:pStyle w:val="ListParagraph"/>
-        <w:numPr>
-          <w:ilvl w:val="0"/>
-          <w:numId w:val="2"/>
-        </w:numPr>
-        <w:spacing w:after="30"/>
-      </w:pPr>
-      <w:r>
-        <w:rPr>
-          <w:rFonts w:ascii="Calibri" w:cs="Calibri" w:eastAsia="Calibri" w:hAnsi="Calibri"/>
-          <w:sz w:val="19"/>
-          <w:szCs w:val="19"/>
-        </w:rPr>
-        <w:t xml:space="preserve">Lead a 250-person global IT and Engineering organization (11 functional areas, ~$50M budget) spanning ~600 applications, ~8,000 systems, 6 data centers, and 5 Azure regions, with offices across North America, Europe, Asia and Australia.</w:t>
+        <w:t xml:space="preserve">KLDiscovery, LLC	Remote, Greater Denver Area, CO</w:t>
+      </w:r>
+    </w:p>
+    <w:p>
+      <w:pPr>
+        <w:pStyle w:val="ListParagraph"/>
+        <w:numPr>
+          <w:ilvl w:val="0"/>
+          <w:numId w:val="2"/>
+        </w:numPr>
+        <w:spacing w:after="30"/>
+      </w:pPr>
+      <w:r>
+        <w:rPr>
+          <w:rFonts w:ascii="Calibri" w:cs="Calibri" w:eastAsia="Calibri" w:hAnsi="Calibri"/>
+          <w:sz w:val="19"/>
+          <w:szCs w:val="19"/>
+        </w:rPr>
+        <w:t xml:space="preserve">Directed architecture for Nebula AI Case Explorer, an AI-powered early case assessment product taken from concept to launch in 8 months, with its first paying client signed within two weeks.</w:t>
+      </w:r>
+    </w:p>
+    <w:p>
+      <w:pPr>
+        <w:pStyle w:val="ListParagraph"/>
+        <w:numPr>
+          <w:ilvl w:val="0"/>
+          <w:numId w:val="2"/>
+        </w:numPr>
+        <w:spacing w:after="30"/>
+      </w:pPr>
+      <w:r>
+        <w:rPr>
+          <w:rFonts w:ascii="Calibri" w:cs="Calibri" w:eastAsia="Calibri" w:hAnsi="Calibri"/>
+          <w:sz w:val="19"/>
+          <w:szCs w:val="19"/>
+        </w:rPr>
+        <w:t xml:space="preserve">Consolidated eDiscovery processing onto a single workflow (Nebula ECA), enabling ECA to be sold as an entry point to hosting. All new matters now run on it. Extended AI into the product with an in-app ReadySuite agent that completes user actions from natural-language prompts.</w:t>
+      </w:r>
+    </w:p>
+    <w:p>
+      <w:pPr>
+        <w:pStyle w:val="ListParagraph"/>
+        <w:numPr>
+          <w:ilvl w:val="0"/>
+          <w:numId w:val="2"/>
+        </w:numPr>
+        <w:spacing w:after="30"/>
+      </w:pPr>
+      <w:r>
+        <w:rPr>
+          <w:rFonts w:ascii="Calibri" w:cs="Calibri" w:eastAsia="Calibri" w:hAnsi="Calibri"/>
+          <w:sz w:val="19"/>
+          <w:szCs w:val="19"/>
+        </w:rPr>
+        <w:t xml:space="preserve">Lead a 250-person global IT and Engineering organization (11 functional areas, ~$50M budget) spanning ~600 applications, with offices across North America, Europe, Asia and Australia.</w:t>
       </w:r>
     </w:p>
     <w:p>
@@ -751,7 +731,7 @@
           <w:sz w:val="19"/>
           <w:szCs w:val="19"/>
         </w:rPr>
-        <w:t xml:space="preserve">Rebuilt the IT and Engineering operating model: consolidated IT under Engineering, stood up a dedicated Software Architecture function (a Director and 5 architects), delayered engineering management by roughly half, and reduced IT headcount by more than 30% while holding operational coverage. Feature delivery became faster and more consistent under the new model.</w:t>
+        <w:t xml:space="preserve">Rebuilt the IT and Engineering operating model: consolidated IT under Engineering, stood up a dedicated Software Architecture function (a Director and 5 architects), and delayered engineering management while holding operational coverage. Feature delivery became faster and more consistent under the new model.</w:t>
       </w:r>
     </w:p>
     <w:p>
@@ -787,25 +767,25 @@
           <w:sz w:val="19"/>
           <w:szCs w:val="19"/>
         </w:rPr>
-        <w:t xml:space="preserve">Cut P1 incident response time in half, from 60 to 30 minutes, alongside a security program restructure and CISO hire; contracted and deployed CrowdStrike EDR across the environment.</w:t>
-      </w:r>
-    </w:p>
-    <w:p>
-      <w:pPr>
-        <w:pStyle w:val="ListParagraph"/>
-        <w:numPr>
-          <w:ilvl w:val="0"/>
-          <w:numId w:val="2"/>
-        </w:numPr>
-        <w:spacing w:after="30"/>
-      </w:pPr>
-      <w:r>
-        <w:rPr>
-          <w:rFonts w:ascii="Calibri" w:cs="Calibri" w:eastAsia="Calibri" w:hAnsi="Calibri"/>
-          <w:sz w:val="19"/>
-          <w:szCs w:val="19"/>
-        </w:rPr>
-        <w:t xml:space="preserve">Reduced the global data center footprint, including closing an international site; led decommissioning of a legacy eDiscovery review platform across 5 data centers (final site in progress) and stood up a fully independent Relativity disaster recovery environment.</w:t>
+        <w:t xml:space="preserve">Cut P1 incident response time in half, from 60 to 30 minutes, alongside a security program restructure and CISO hire; deployed endpoint detection and response (EDR) across the environment.</w:t>
+      </w:r>
+    </w:p>
+    <w:p>
+      <w:pPr>
+        <w:pStyle w:val="ListParagraph"/>
+        <w:numPr>
+          <w:ilvl w:val="0"/>
+          <w:numId w:val="2"/>
+        </w:numPr>
+        <w:spacing w:after="30"/>
+      </w:pPr>
+      <w:r>
+        <w:rPr>
+          <w:rFonts w:ascii="Calibri" w:cs="Calibri" w:eastAsia="Calibri" w:hAnsi="Calibri"/>
+          <w:sz w:val="19"/>
+          <w:szCs w:val="19"/>
+        </w:rPr>
+        <w:t xml:space="preserve">Reduced the global data center footprint, led decommissioning of a legacy eDiscovery review platform, and stood up a fully independent Relativity disaster recovery environment.</w:t>
       </w:r>
     </w:p>
     <w:p>
@@ -824,17 +804,7 @@
           <w:sz w:val="20"/>
           <w:szCs w:val="20"/>
         </w:rPr>
-        <w:t xml:space="preserve">Executive VP, Engineering</w:t>
-      </w:r>
-      <w:r>
-        <w:rPr>
-          <w:rFonts w:ascii="Calibri" w:cs="Calibri" w:eastAsia="Calibri" w:hAnsi="Calibri"/>
-          <w:b/>
-          <w:bCs/>
-          <w:sz w:val="20"/>
-          <w:szCs w:val="20"/>
-        </w:rPr>
-        <w:t xml:space="preserve">	Feb 2020 – Sep 2025</w:t>
+        <w:t xml:space="preserve">Executive VP, Engineering	Feb 2020 – Sep 2025</w:t>
       </w:r>
     </w:p>
     <w:p>
@@ -853,17 +823,7 @@
           <w:sz w:val="19"/>
           <w:szCs w:val="19"/>
         </w:rPr>
-        <w:t xml:space="preserve">KLDiscovery, LLC</w:t>
-      </w:r>
-      <w:r>
-        <w:rPr>
-          <w:rFonts w:ascii="Calibri" w:cs="Calibri" w:eastAsia="Calibri" w:hAnsi="Calibri"/>
-          <w:i/>
-          <w:iCs/>
-          <w:sz w:val="19"/>
-          <w:szCs w:val="19"/>
-        </w:rPr>
-        <w:t xml:space="preserve">	Remote, Philadelphia, PA</w:t>
+        <w:t xml:space="preserve">KLDiscovery, LLC	Remote, Philadelphia, PA</w:t>
       </w:r>
     </w:p>
     <w:p>
@@ -954,17 +914,7 @@
           <w:sz w:val="20"/>
           <w:szCs w:val="20"/>
         </w:rPr>
-        <w:t xml:space="preserve">Vice President, Engineering</w:t>
-      </w:r>
-      <w:r>
-        <w:rPr>
-          <w:rFonts w:ascii="Calibri" w:cs="Calibri" w:eastAsia="Calibri" w:hAnsi="Calibri"/>
-          <w:b/>
-          <w:bCs/>
-          <w:sz w:val="20"/>
-          <w:szCs w:val="20"/>
-        </w:rPr>
-        <w:t xml:space="preserve">	Mar 2016 – Feb 2020</w:t>
+        <w:t xml:space="preserve">Vice President, Engineering	Mar 2016 – Feb 2020</w:t>
       </w:r>
     </w:p>
     <w:p>
@@ -983,17 +933,7 @@
           <w:sz w:val="19"/>
           <w:szCs w:val="19"/>
         </w:rPr>
-        <w:t xml:space="preserve">KLDiscovery, LLC</w:t>
-      </w:r>
-      <w:r>
-        <w:rPr>
-          <w:rFonts w:ascii="Calibri" w:cs="Calibri" w:eastAsia="Calibri" w:hAnsi="Calibri"/>
-          <w:i/>
-          <w:iCs/>
-          <w:sz w:val="19"/>
-          <w:szCs w:val="19"/>
-        </w:rPr>
-        <w:t xml:space="preserve">	Ambler, PA</w:t>
+        <w:t xml:space="preserve">KLDiscovery, LLC	Ambler, PA</w:t>
       </w:r>
     </w:p>
     <w:p>
@@ -1066,17 +1006,7 @@
           <w:sz w:val="20"/>
           <w:szCs w:val="20"/>
         </w:rPr>
-        <w:t xml:space="preserve">Director, Engineering</w:t>
-      </w:r>
-      <w:r>
-        <w:rPr>
-          <w:rFonts w:ascii="Calibri" w:cs="Calibri" w:eastAsia="Calibri" w:hAnsi="Calibri"/>
-          <w:b/>
-          <w:bCs/>
-          <w:sz w:val="20"/>
-          <w:szCs w:val="20"/>
-        </w:rPr>
-        <w:t xml:space="preserve">	Jan 2014 – Mar 2016</w:t>
+        <w:t xml:space="preserve">Director, Engineering	Jan 2014 – Mar 2016</w:t>
       </w:r>
     </w:p>
     <w:p>
@@ -1095,17 +1025,7 @@
           <w:sz w:val="19"/>
           <w:szCs w:val="19"/>
         </w:rPr>
-        <w:t xml:space="preserve">KLDiscovery, LLC</w:t>
-      </w:r>
-      <w:r>
-        <w:rPr>
-          <w:rFonts w:ascii="Calibri" w:cs="Calibri" w:eastAsia="Calibri" w:hAnsi="Calibri"/>
-          <w:i/>
-          <w:iCs/>
-          <w:sz w:val="19"/>
-          <w:szCs w:val="19"/>
-        </w:rPr>
-        <w:t xml:space="preserve">	Ambler, PA</w:t>
+        <w:t xml:space="preserve">KLDiscovery, LLC	Ambler, PA</w:t>
       </w:r>
     </w:p>
     <w:p>
@@ -1160,17 +1080,7 @@
           <w:sz w:val="20"/>
           <w:szCs w:val="20"/>
         </w:rPr>
-        <w:t xml:space="preserve">Software Engineer → Software Team Lead → Manager, Engineering</w:t>
-      </w:r>
-      <w:r>
-        <w:rPr>
-          <w:rFonts w:ascii="Calibri" w:cs="Calibri" w:eastAsia="Calibri" w:hAnsi="Calibri"/>
-          <w:b/>
-          <w:bCs/>
-          <w:sz w:val="20"/>
-          <w:szCs w:val="20"/>
-        </w:rPr>
-        <w:t xml:space="preserve">	May 2011 – Jan 2014</w:t>
+        <w:t xml:space="preserve">Software Engineer → Software Team Lead → Manager, Engineering	May 2011 – Jan 2014</w:t>
       </w:r>
     </w:p>
     <w:p>
@@ -1189,17 +1099,7 @@
           <w:sz w:val="19"/>
           <w:szCs w:val="19"/>
         </w:rPr>
-        <w:t xml:space="preserve">KLDiscovery, LLC</w:t>
-      </w:r>
-      <w:r>
-        <w:rPr>
-          <w:rFonts w:ascii="Calibri" w:cs="Calibri" w:eastAsia="Calibri" w:hAnsi="Calibri"/>
-          <w:i/>
-          <w:iCs/>
-          <w:sz w:val="19"/>
-          <w:szCs w:val="19"/>
-        </w:rPr>
-        <w:t xml:space="preserve">	Fort Washington, PA</w:t>
+        <w:t xml:space="preserve">KLDiscovery, LLC	Fort Washington, PA</w:t>
       </w:r>
     </w:p>
     <w:p>
@@ -1272,17 +1172,7 @@
           <w:sz w:val="20"/>
           <w:szCs w:val="20"/>
         </w:rPr>
-        <w:t xml:space="preserve">Intern / Software Developer</w:t>
-      </w:r>
-      <w:r>
-        <w:rPr>
-          <w:rFonts w:ascii="Calibri" w:cs="Calibri" w:eastAsia="Calibri" w:hAnsi="Calibri"/>
-          <w:b/>
-          <w:bCs/>
-          <w:sz w:val="20"/>
-          <w:szCs w:val="20"/>
-        </w:rPr>
-        <w:t xml:space="preserve">	2009 – 2011</w:t>
+        <w:t xml:space="preserve">Intern / Software Developer	2009 – 2011</w:t>
       </w:r>
     </w:p>
     <w:p>
@@ -1301,17 +1191,7 @@
           <w:sz w:val="19"/>
           <w:szCs w:val="19"/>
         </w:rPr>
-        <w:t xml:space="preserve">BLaST Intermediate Unit 17</w:t>
-      </w:r>
-      <w:r>
-        <w:rPr>
-          <w:rFonts w:ascii="Calibri" w:cs="Calibri" w:eastAsia="Calibri" w:hAnsi="Calibri"/>
-          <w:i/>
-          <w:iCs/>
-          <w:sz w:val="19"/>
-          <w:szCs w:val="19"/>
-        </w:rPr>
-        <w:t xml:space="preserve">	Williamsport, PA</w:t>
+        <w:t xml:space="preserve">BLaST Intermediate Unit 17	Williamsport, PA</w:t>
       </w:r>
     </w:p>
     <w:p>

</xml_diff>